<commit_message>
Informe de impacto actualizado
</commit_message>
<xml_diff>
--- a/Desarrollo/SVL/SVL_II.docx
+++ b/Desarrollo/SVL/SVL_II.docx
@@ -4037,21 +4037,6 @@
           <w:rtl w:val="0"/>
         </w:rPr>
         <w:t xml:space="preserve">Riesgos Identificados y Mitigación</w:t>
-      </w:r>
-    </w:p>
-    <w:p>
-      <w:pPr>
-        <w:ind w:left="0" w:firstLine="0"/>
-        <w:rPr>
-          <w:rFonts w:ascii="Times New Roman" w:cs="Times New Roman" w:eastAsia="Times New Roman" w:hAnsi="Times New Roman"/>
-          <w:sz w:val="26"/>
-          <w:szCs w:val="26"/>
-        </w:rPr>
-      </w:pPr>
-      <w:r>
-        <w:rPr>
-          <w:rtl w:val="0"/>
-        </w:rPr>
       </w:r>
     </w:p>
     <w:p>

</xml_diff>